<commit_message>
Fix number formatting in the copyable Table 1
Co-Authored-By: Claude Sonnet 5.5 <noreply@anthropic.com>
</commit_message>
<xml_diff>
--- a/docs/manuscript/Table1_constraint_bounds.docx
+++ b/docs/manuscript/Table1_constraint_bounds.docx
@@ -238,7 +238,7 @@
               <w:jc w:val="center"/>
             </w:pPr>
             <w:r>
-              <w:t>162</w:t>
+              <w:t>162.0</w:t>
             </w:r>
           </w:p>
         </w:tc>
@@ -277,7 +277,7 @@
               <w:jc w:val="center"/>
             </w:pPr>
             <w:r>
-              <w:t>0.35</w:t>
+              <w:t>0.350</w:t>
             </w:r>
           </w:p>
         </w:tc>
@@ -597,7 +597,7 @@
               <w:jc w:val="center"/>
             </w:pPr>
             <w:r>
-              <w:t>1</w:t>
+              <w:t>1.000</w:t>
             </w:r>
           </w:p>
         </w:tc>
@@ -917,7 +917,7 @@
               <w:jc w:val="center"/>
             </w:pPr>
             <w:r>
-              <w:t>0.02</w:t>
+              <w:t>0.020</w:t>
             </w:r>
           </w:p>
         </w:tc>

</xml_diff>

<commit_message>
Regenerate the copyable constraint-bounds table with the PANYNJ water-reducer labels
Co-Authored-By: Claude Sonnet 5.5 <noreply@anthropic.com>
</commit_message>
<xml_diff>
--- a/docs/manuscript/Table1_constraint_bounds.docx
+++ b/docs/manuscript/Table1_constraint_bounds.docx
@@ -718,7 +718,7 @@
               <w:jc w:val="center"/>
             </w:pPr>
             <w:r>
-              <w:t>7.82</w:t>
+              <w:t>4.71</w:t>
             </w:r>
           </w:p>
         </w:tc>
@@ -798,7 +798,7 @@
               <w:jc w:val="center"/>
             </w:pPr>
             <w:r>
-              <w:t>4.71</w:t>
+              <w:t>7.82</w:t>
             </w:r>
           </w:p>
         </w:tc>
@@ -917,7 +917,7 @@
               <w:jc w:val="center"/>
             </w:pPr>
             <w:r>
-              <w:t>0.020</w:t>
+              <w:t>0.012</w:t>
             </w:r>
           </w:p>
         </w:tc>
@@ -991,7 +991,7 @@
               <w:jc w:val="center"/>
             </w:pPr>
             <w:r>
-              <w:t>0.012</w:t>
+              <w:t>0.020</w:t>
             </w:r>
           </w:p>
         </w:tc>
@@ -1076,7 +1076,7 @@
         <w:rPr>
           <w:sz w:val="18"/>
         </w:rPr>
-        <w:t>Note: Binders, aggregates, and water were converted from lb/yd³ with a factor of 0.5933. Chemical admixtures were converted from oz/yd³ with a factor of 0.03708. Densities used in Equation 1 (kg/m³): PC 3150, FA 2200, SC 2900, FAGG 2630, CAGG 2710, water 1000, AEA 1010, WR_HR 1080, WR 1140, ACC 1340.</w:t>
+        <w:t>Note: Binders, aggregates, and water were converted from lb/yd³ with a factor of 0.5933. Chemical admixtures were converted from oz/yd³ with a factor of 0.03708. Densities used in Equation 1 (kg/m³): PC 3150, FA 2200, SC 2900, FAGG 2630, CAGG 2710, water 1000, AEA 1010, WR_HR 1140, WR 1080, ACC 1340.</w:t>
       </w:r>
     </w:p>
     <w:sectPr>

</xml_diff>